<commit_message>
fix laTex math expression rendering errors
</commit_message>
<xml_diff>
--- a/docs/parflm/Pairwise_Potentials_in_PARFLM_Theory_and_Design.docx
+++ b/docs/parflm/Pairwise_Potentials_in_PARFLM_Theory_and_Design.docx
@@ -1757,6 +1757,45 @@
         </w:rPr>
         <w:t xml:space="preserve"> </w:t>
       </w:r>
+      <w:r>
+        <w:rPr>
+          <w:rFonts w:eastAsiaTheme="minorEastAsia"/>
+        </w:rPr>
+        <w:t xml:space="preserve">     </w:t>
+      </w:r>
+      <w:r>
+        <w:rPr>
+          <w:rFonts w:eastAsiaTheme="minorEastAsia"/>
+        </w:rPr>
+        <w:t>(gmb.1)</w:t>
+      </w:r>
+    </w:p>
+    <w:p>
+      <w:pPr>
+        <w:rPr>
+          <w:rFonts w:eastAsiaTheme="minorEastAsia"/>
+        </w:rPr>
+      </w:pPr>
+      <w:r>
+        <w:rPr>
+          <w:rFonts w:eastAsiaTheme="minorEastAsia"/>
+        </w:rPr>
+        <w:t xml:space="preserve">Here </w:t>
+      </w:r>
+      <m:oMath>
+        <m:r>
+          <w:rPr>
+            <w:rFonts w:ascii="Cambria Math" w:eastAsiaTheme="minorEastAsia" w:hAnsi="Cambria Math"/>
+          </w:rPr>
+          <m:t>τ</m:t>
+        </m:r>
+      </m:oMath>
+      <w:r>
+        <w:rPr>
+          <w:rFonts w:eastAsiaTheme="minorEastAsia"/>
+        </w:rPr>
+        <w:t xml:space="preserve"> is the parameter of the Gumbel-softmax distribution.</w:t>
+      </w:r>
     </w:p>
     <w:p>
       <w:pPr>
@@ -2165,6 +2204,24 @@
       </w:hyperlink>
     </w:p>
     <w:p/>
+    <w:p/>
+    <w:p>
+      <w:pPr>
+        <w:pStyle w:val="Heading1"/>
+      </w:pPr>
+      <w:r>
+        <w:t xml:space="preserve">Appendix </w:t>
+      </w:r>
+    </w:p>
+    <w:p/>
+    <w:p>
+      <w:pPr>
+        <w:pStyle w:val="Heading2"/>
+      </w:pPr>
+      <w:r>
+        <w:t>Categorical Sampling and the Gumbel-Max trick</w:t>
+      </w:r>
+    </w:p>
     <w:p/>
     <w:p/>
     <w:sectPr>
@@ -2611,7 +2668,6 @@
     <w:next w:val="Normal"/>
     <w:link w:val="Heading2Char"/>
     <w:uiPriority w:val="9"/>
-    <w:semiHidden/>
     <w:unhideWhenUsed/>
     <w:qFormat/>
     <w:rsid w:val="000318EC"/>
@@ -2825,7 +2881,6 @@
     <w:basedOn w:val="DefaultParagraphFont"/>
     <w:link w:val="Heading2"/>
     <w:uiPriority w:val="9"/>
-    <w:semiHidden/>
     <w:rsid w:val="000318EC"/>
     <w:rPr>
       <w:rFonts w:ascii="Calibri Light" w:eastAsiaTheme="majorEastAsia" w:hAnsi="Calibri Light" w:cstheme="majorBidi"/>

</xml_diff>